<commit_message>
actualizar documento oficial con enlaces y agregar boton de acceso a repositorio en presentacion web
</commit_message>
<xml_diff>
--- a/ACA_Computacion_Nube_Cristian_Tabares.docx
+++ b/ACA_Computacion_Nube_Cristian_Tabares.docx
@@ -927,10 +927,32 @@
                 <w:rStyle w:val="187"/>
                 <w:rFonts w:ascii="Times New Roman" w:hAnsi="Times New Roman" w:eastAsia="Times New Roman" w:cs="Times New Roman"/>
                 <w:b/>
+                <w:bCs/>
                 <w:highlight w:val="none"/>
                 <w:lang w:val="es-MX"/>
               </w:rPr>
-              <w:t xml:space="preserve">Documentación construida durante el ACA</w:t>
+              <w:t xml:space="preserve">6. </w:t>
+            </w:r>
+            <w:r>
+              <w:rPr>
+                <w:rStyle w:val="187"/>
+                <w:rFonts w:ascii="Times New Roman" w:hAnsi="Times New Roman" w:eastAsia="Times New Roman" w:cs="Times New Roman"/>
+                <w:b/>
+                <w:bCs/>
+                <w:highlight w:val="none"/>
+                <w:lang w:val="es-MX"/>
+              </w:rPr>
+              <w:t xml:space="preserve">D</w:t>
+            </w:r>
+            <w:r>
+              <w:rPr>
+                <w:rStyle w:val="187"/>
+                <w:rFonts w:ascii="Times New Roman" w:hAnsi="Times New Roman" w:eastAsia="Times New Roman" w:cs="Times New Roman"/>
+                <w:b/>
+                <w:highlight w:val="none"/>
+                <w:lang w:val="es-MX"/>
+              </w:rPr>
+              <w:t xml:space="preserve">ocumentación construida durante el ACA </w:t>
             </w:r>
             <w:r>
               <w:rPr>
@@ -970,9 +992,6 @@
             <w:spacing/>
             <w:ind/>
             <w:rPr>
-              <w:rFonts w:ascii="Times New Roman" w:hAnsi="Times New Roman" w:cs="Times New Roman"/>
-              <w:b/>
-              <w:bCs/>
               <w:highlight w:val="none"/>
             </w:rPr>
           </w:pPr>
@@ -987,8 +1006,17 @@
                 <w:rStyle w:val="187"/>
                 <w:rFonts w:ascii="Times New Roman" w:hAnsi="Times New Roman" w:eastAsia="Times New Roman" w:cs="Times New Roman"/>
                 <w:b/>
+                <w:lang w:val="es-MX"/>
               </w:rPr>
-              <w:t xml:space="preserve">6. Referencias Bibliográficas</w:t>
+              <w:t xml:space="preserve">7</w:t>
+            </w:r>
+            <w:r>
+              <w:rPr>
+                <w:rStyle w:val="187"/>
+                <w:rFonts w:ascii="Times New Roman" w:hAnsi="Times New Roman" w:eastAsia="Times New Roman" w:cs="Times New Roman"/>
+                <w:b/>
+              </w:rPr>
+              <w:t xml:space="preserve">. Referencias Bibliográficas</w:t>
             </w:r>
             <w:r>
               <w:rPr>
@@ -1009,9 +1037,6 @@
           </w:hyperlink>
           <w:r>
             <w:rPr>
-              <w:rFonts w:ascii="Times New Roman" w:hAnsi="Times New Roman" w:cs="Times New Roman"/>
-              <w:b/>
-              <w:bCs/>
               <w:highlight w:val="none"/>
             </w:rPr>
           </w:r>
@@ -1033,16 +1058,7 @@
           <w:r>
             <w:fldChar w:fldCharType="end"/>
           </w:r>
-          <w:r>
-            <w:rPr>
-              <w:rFonts w:ascii="Times New Roman" w:hAnsi="Times New Roman" w:eastAsia="Times New Roman" w:cs="Times New Roman"/>
-              <w:b/>
-              <w:bCs/>
-              <w:sz w:val="24"/>
-              <w:szCs w:val="24"/>
-              <w:highlight w:val="none"/>
-            </w:rPr>
-          </w:r>
+          <w:r/>
           <w:r/>
         </w:p>
       </w:sdtContent>
@@ -1112,6 +1128,7 @@
         </w:rPr>
         <w:t xml:space="preserve">1. Introducción y Planteamiento del Problema</w:t>
       </w:r>
+      <w:r/>
       <w:bookmarkEnd w:id="1"/>
       <w:r/>
       <w:r>
@@ -1432,6 +1449,7 @@
         </w:rPr>
         <w:t xml:space="preserve">2. Diseño de Arquitectura Estratégica en la Nube</w:t>
       </w:r>
+      <w:r/>
       <w:bookmarkEnd w:id="2"/>
       <w:r/>
       <w:r>
@@ -1729,6 +1747,7 @@
         </w:rPr>
         <w:t xml:space="preserve">2.2 Capa de Aplicación, Marketplace y Almacenamiento Transaccional</w:t>
       </w:r>
+      <w:r/>
       <w:bookmarkEnd w:id="3"/>
       <w:r/>
       <w:r>
@@ -1930,6 +1949,7 @@
         </w:rPr>
         <w:t xml:space="preserve">3. Evaluación FinOps y Análisis Financiero</w:t>
       </w:r>
+      <w:r/>
       <w:bookmarkEnd w:id="4"/>
       <w:r/>
       <w:r>
@@ -2173,6 +2193,7 @@
         </w:rPr>
         <w:t xml:space="preserve">3.1 Análisis de Retorno de Inversión (ROI) y Valor Actual Neto (VAN)</w:t>
       </w:r>
+      <w:r/>
       <w:bookmarkEnd w:id="5"/>
       <w:r/>
       <w:r>
@@ -2358,6 +2379,7 @@
         </w:rPr>
         <w:t xml:space="preserve">4. Seguridad, Gobernanza y Continuidad del Negocio</w:t>
       </w:r>
+      <w:r/>
       <w:bookmarkEnd w:id="6"/>
       <w:r/>
       <w:r>
@@ -2516,6 +2538,7 @@
         </w:rPr>
         <w:t xml:space="preserve">4.1 Alta Disponibilidad, Resiliencia y Métricas de Continuidad (SLA, RPO y RTO)</w:t>
       </w:r>
+      <w:r/>
       <w:bookmarkEnd w:id="7"/>
       <w:r/>
       <w:r>
@@ -2702,6 +2725,7 @@
         </w:rPr>
         <w:t xml:space="preserve">4.2 Cumplimiento Normativo y Soberanía de Datos en Colombia</w:t>
       </w:r>
+      <w:r/>
       <w:bookmarkEnd w:id="8"/>
       <w:r/>
       <w:r>
@@ -2887,6 +2911,7 @@
         </w:rPr>
         <w:t xml:space="preserve">5. Sostenibilidad Ambiental, Ética Profesional y Cierre</w:t>
       </w:r>
+      <w:r/>
       <w:bookmarkEnd w:id="9"/>
       <w:r/>
       <w:r>
@@ -3077,6 +3102,8 @@
           <w:highlight w:val="none"/>
         </w:rPr>
       </w:pPr>
+      <w:r/>
+      <w:bookmarkStart w:id="10" w:name="_Toc10"/>
       <w:r>
         <w:rPr>
           <w:rFonts w:ascii="Times New Roman" w:hAnsi="Times New Roman" w:eastAsia="Times New Roman" w:cs="Times New Roman"/>
@@ -3089,7 +3116,6 @@
         </w:rPr>
         <w:t xml:space="preserve">6. </w:t>
       </w:r>
-      <w:bookmarkStart w:id="10" w:name="_Toc10"/>
       <w:r>
         <w:rPr>
           <w:rFonts w:ascii="Times New Roman" w:hAnsi="Times New Roman" w:eastAsia="Times New Roman" w:cs="Times New Roman"/>
@@ -3114,6 +3140,7 @@
         <w:t xml:space="preserve">ocumentación construida durante el ACA</w:t>
         <w:br/>
       </w:r>
+      <w:r/>
       <w:bookmarkEnd w:id="10"/>
       <w:r/>
       <w:r>
@@ -3157,6 +3184,30 @@
       <w:r>
         <w:t xml:space="preserve">Documento formal completo bajo normas APA 7 (interlineado 1.5, sangría en primera línea, portada institucional, justificación técnica, arquitectura AWS, evaluación FinOps, seguridad, soberanía de datos Ley 1581 y referencias).</w:t>
       </w:r>
+      <w:r>
+        <w:rPr>
+          <w:rFonts w:ascii="Times New Roman" w:hAnsi="Times New Roman" w:eastAsia="Times New Roman" w:cs="Times New Roman"/>
+          <w:b w:val="0"/>
+          <w:bCs w:val="0"/>
+          <w:sz w:val="24"/>
+          <w:szCs w:val="24"/>
+          <w:highlight w:val="none"/>
+          <w:lang w:val="es-MX"/>
+        </w:rPr>
+        <w:t xml:space="preserve"> </w:t>
+      </w:r>
+      <w:hyperlink r:id="rId10" w:tooltip="https://github.com/soycamiloypunto/Universidad_Computacion_Nube/blob/main/ACA_Computacion_Nube_Cristian_Tabares.docx" w:history="1">
+        <w:r>
+          <w:rPr>
+            <w:rStyle w:val="187"/>
+            <w:rFonts w:ascii="Times New Roman" w:hAnsi="Times New Roman" w:eastAsia="Times New Roman" w:cs="Times New Roman"/>
+            <w:color w:val="0000ee"/>
+            <w:sz w:val="24"/>
+            <w:u w:val="single"/>
+          </w:rPr>
+          <w:t xml:space="preserve">Universidad_Computacion_Nube/ACA_Computacion_Nube_Cristian_Tabares.docx at main · soycamiloypunto/Universidad_Computacion_Nube</w:t>
+        </w:r>
+      </w:hyperlink>
       <w:r>
         <w:rPr>
           <w:rFonts w:ascii="Times New Roman" w:hAnsi="Times New Roman" w:eastAsia="Times New Roman" w:cs="Times New Roman"/>
@@ -3228,6 +3279,69 @@
           <w:highlight w:val="none"/>
         </w:rPr>
       </w:r>
+      <w:hyperlink r:id="rId11" w:tooltip="https://github.com/soycamiloypunto/Universidad_Computacion_Nube/blob/main/Modelo_FinOps_TCO_ROI_VAN.xlsx" w:history="1">
+        <w:r>
+          <w:rPr>
+            <w:rStyle w:val="187"/>
+            <w:rFonts w:ascii="Times New Roman" w:hAnsi="Times New Roman" w:eastAsia="Times New Roman" w:cs="Times New Roman"/>
+            <w:color w:val="0000ee"/>
+            <w:sz w:val="24"/>
+            <w:u w:val="single"/>
+          </w:rPr>
+          <w:t xml:space="preserve">Universidad_Computacion_Nube/Modelo_FinOps_TCO_ROI_VAN.xlsx at main · soycamiloypunto/Universidad_Computacion_Nube</w:t>
+        </w:r>
+      </w:hyperlink>
+      <w:r>
+        <w:rPr>
+          <w:rFonts w:ascii="Times New Roman" w:hAnsi="Times New Roman" w:eastAsia="Times New Roman" w:cs="Times New Roman"/>
+          <w:b/>
+          <w:sz w:val="24"/>
+          <w:szCs w:val="24"/>
+          <w:highlight w:val="none"/>
+        </w:rPr>
+      </w:r>
+      <w:r>
+        <w:rPr>
+          <w:rFonts w:ascii="Times New Roman" w:hAnsi="Times New Roman" w:eastAsia="Times New Roman" w:cs="Times New Roman"/>
+          <w:b/>
+          <w:bCs/>
+          <w:sz w:val="24"/>
+          <w:szCs w:val="24"/>
+          <w:highlight w:val="none"/>
+        </w:rPr>
+      </w:r>
+    </w:p>
+    <w:p>
+      <w:pPr>
+        <w:spacing/>
+        <w:ind/>
+        <w:rPr>
+          <w:rFonts w:ascii="Times New Roman" w:hAnsi="Times New Roman" w:eastAsia="Times New Roman" w:cs="Times New Roman"/>
+          <w:b/>
+          <w:bCs/>
+          <w:sz w:val="24"/>
+          <w:szCs w:val="24"/>
+          <w:highlight w:val="none"/>
+        </w:rPr>
+      </w:pPr>
+      <w:r>
+        <w:rPr>
+          <w:rFonts w:ascii="Times New Roman" w:hAnsi="Times New Roman" w:eastAsia="Times New Roman" w:cs="Times New Roman"/>
+          <w:b/>
+          <w:sz w:val="24"/>
+          <w:szCs w:val="24"/>
+          <w:highlight w:val="none"/>
+        </w:rPr>
+      </w:r>
+      <w:r>
+        <w:rPr>
+          <w:rFonts w:ascii="Times New Roman" w:hAnsi="Times New Roman" w:eastAsia="Times New Roman" w:cs="Times New Roman"/>
+          <w:b/>
+          <w:sz w:val="24"/>
+          <w:szCs w:val="24"/>
+          <w:highlight w:val="none"/>
+        </w:rPr>
+      </w:r>
       <w:r>
         <w:rPr>
           <w:rFonts w:ascii="Times New Roman" w:hAnsi="Times New Roman" w:eastAsia="Times New Roman" w:cs="Times New Roman"/>
@@ -3316,6 +3430,18 @@
           <w:highlight w:val="none"/>
         </w:rPr>
       </w:r>
+      <w:hyperlink r:id="rId12" w:tooltip="https://github.com/soycamiloypunto/Universidad_Computacion_Nube/blob/main/Diagramas_Arquitectura.md" w:history="1">
+        <w:r>
+          <w:rPr>
+            <w:rStyle w:val="187"/>
+            <w:rFonts w:ascii="Times New Roman" w:hAnsi="Times New Roman" w:eastAsia="Times New Roman" w:cs="Times New Roman"/>
+            <w:color w:val="0000ee"/>
+            <w:sz w:val="24"/>
+            <w:u w:val="single"/>
+          </w:rPr>
+          <w:t xml:space="preserve">Universidad_Computacion_Nube/Diagramas_Arquitectura.md at main · soycamiloypunto/Universidad_Computacion_Nube</w:t>
+        </w:r>
+      </w:hyperlink>
       <w:r>
         <w:rPr>
           <w:rFonts w:ascii="Times New Roman" w:hAnsi="Times New Roman" w:eastAsia="Times New Roman" w:cs="Times New Roman"/>
@@ -3323,56 +3449,6 @@
           <w:sz w:val="24"/>
           <w:szCs w:val="24"/>
           <w:highlight w:val="none"/>
-        </w:rPr>
-      </w:r>
-    </w:p>
-    <w:p>
-      <w:pPr>
-        <w:spacing/>
-        <w:ind/>
-        <w:rPr>
-          <w:rFonts w:ascii="Times New Roman" w:hAnsi="Times New Roman" w:eastAsia="Times New Roman" w:cs="Times New Roman"/>
-          <w:color w:val="000000"/>
-          <w:sz w:val="24"/>
-          <w:szCs w:val="24"/>
-        </w:rPr>
-      </w:pPr>
-      <w:r>
-        <w:rPr>
-          <w:rFonts w:ascii="Times New Roman" w:hAnsi="Times New Roman" w:eastAsia="Times New Roman" w:cs="Times New Roman"/>
-          <w:color w:val="000000"/>
-          <w:sz w:val="24"/>
-        </w:rPr>
-      </w:r>
-      <w:r>
-        <w:rPr>
-          <w:rFonts w:ascii="Times New Roman" w:hAnsi="Times New Roman" w:eastAsia="Times New Roman" w:cs="Times New Roman"/>
-          <w:color w:val="000000"/>
-          <w:sz w:val="24"/>
-        </w:rPr>
-        <w:t xml:space="preserve">Diapositivas interactivas para proyectar durante la grabación o sustentar en pantalla compartida, con temporizador regresivo de 10 minutos integrado y atajos de teclado </w:t>
-      </w:r>
-      <w:r>
-        <w:rPr>
-          <w:rFonts w:ascii="Courier New" w:hAnsi="Courier New" w:eastAsia="Courier New" w:cs="Courier New"/>
-          <w:color w:val="000000"/>
-          <w:sz w:val="20"/>
-        </w:rPr>
-        <w:t xml:space="preserve">[← / →]</w:t>
-      </w:r>
-      <w:r>
-        <w:rPr>
-          <w:rFonts w:ascii="Times New Roman" w:hAnsi="Times New Roman" w:eastAsia="Times New Roman" w:cs="Times New Roman"/>
-          <w:color w:val="000000"/>
-          <w:sz w:val="24"/>
-        </w:rPr>
-        <w:t xml:space="preserve">.</w:t>
-      </w:r>
-      <w:r>
-        <w:rPr>
-          <w:rFonts w:ascii="Times New Roman" w:hAnsi="Times New Roman" w:eastAsia="Times New Roman" w:cs="Times New Roman"/>
-          <w:color w:val="000000"/>
-          <w:sz w:val="24"/>
         </w:rPr>
       </w:r>
       <w:r>
@@ -3402,8 +3478,10 @@
       <w:r>
         <w:rPr>
           <w:rFonts w:ascii="Times New Roman" w:hAnsi="Times New Roman" w:eastAsia="Times New Roman" w:cs="Times New Roman"/>
-          <w:color w:val="000000"/>
+          <w:b/>
           <w:sz w:val="24"/>
+          <w:szCs w:val="24"/>
+          <w:highlight w:val="none"/>
         </w:rPr>
       </w:r>
       <w:r>
@@ -3414,14 +3492,63 @@
           <w:szCs w:val="24"/>
           <w:highlight w:val="none"/>
         </w:rPr>
-        <w:br w:type="page" w:clear="all"/>
       </w:r>
-      <w:r/>
-      <w:r/>
+      <w:r>
+        <w:rPr>
+          <w:rFonts w:ascii="Times New Roman" w:hAnsi="Times New Roman" w:eastAsia="Times New Roman" w:cs="Times New Roman"/>
+          <w:b/>
+          <w:sz w:val="24"/>
+          <w:szCs w:val="24"/>
+          <w:highlight w:val="none"/>
+        </w:rPr>
+      </w:r>
     </w:p>
     <w:p>
       <w:pPr>
-        <w:pStyle w:val="139"/>
+        <w:spacing/>
+        <w:ind/>
+        <w:rPr>
+          <w:rFonts w:ascii="Times New Roman" w:hAnsi="Times New Roman" w:eastAsia="Times New Roman" w:cs="Times New Roman"/>
+          <w:color w:val="000000"/>
+          <w:sz w:val="24"/>
+          <w:szCs w:val="24"/>
+          <w:highlight w:val="none"/>
+        </w:rPr>
+      </w:pPr>
+      <w:r>
+        <w:rPr>
+          <w:rFonts w:ascii="Times New Roman" w:hAnsi="Times New Roman" w:eastAsia="Times New Roman" w:cs="Times New Roman"/>
+          <w:color w:val="000000"/>
+          <w:sz w:val="24"/>
+        </w:rPr>
+      </w:r>
+      <w:r>
+        <w:rPr>
+          <w:rFonts w:ascii="Times New Roman" w:hAnsi="Times New Roman" w:eastAsia="Times New Roman" w:cs="Times New Roman"/>
+          <w:color w:val="000000"/>
+          <w:sz w:val="24"/>
+        </w:rPr>
+        <w:t xml:space="preserve">Diapositivas interactivas para proyectar durante la grabación o sustentar en pantalla compartida</w:t>
+      </w:r>
+      <w:r>
+        <w:rPr>
+          <w:rFonts w:ascii="Times New Roman" w:hAnsi="Times New Roman" w:eastAsia="Times New Roman" w:cs="Times New Roman"/>
+          <w:color w:val="000000"/>
+          <w:sz w:val="24"/>
+        </w:rPr>
+      </w:r>
+      <w:r>
+        <w:rPr>
+          <w:rFonts w:ascii="Times New Roman" w:hAnsi="Times New Roman" w:eastAsia="Times New Roman" w:cs="Times New Roman"/>
+          <w:color w:val="000000"/>
+          <w:sz w:val="24"/>
+          <w:szCs w:val="24"/>
+        </w:rPr>
+      </w:r>
+    </w:p>
+    <w:p>
+      <w:pPr>
+        <w:shd w:val="nil" w:color="ffffff"/>
         <w:spacing/>
         <w:ind/>
         <w:rPr>
@@ -3433,8 +3560,52 @@
           <w:highlight w:val="none"/>
         </w:rPr>
       </w:pPr>
+      <w:r>
+        <w:rPr>
+          <w:highlight w:val="none"/>
+        </w:rPr>
+      </w:r>
+      <w:hyperlink r:id="rId13" w:tooltip="https://soycamiloypunto.github.io/Universidad_Computacion_Nube/" w:history="1">
+        <w:r>
+          <w:rPr>
+            <w:rStyle w:val="187"/>
+            <w:rFonts w:ascii="Times New Roman" w:hAnsi="Times New Roman" w:eastAsia="Times New Roman" w:cs="Times New Roman"/>
+            <w:color w:val="0000ee"/>
+            <w:sz w:val="24"/>
+            <w:u w:val="single"/>
+          </w:rPr>
+          <w:t xml:space="preserve">Pitch ACA — Computación en la Nube | AgroSilvania Conectada</w:t>
+        </w:r>
+      </w:hyperlink>
+      <w:r>
+        <w:rPr>
+          <w:highlight w:val="none"/>
+        </w:rPr>
+        <w:br w:type="page" w:clear="all"/>
+      </w:r>
+      <w:r>
+        <w:rPr>
+          <w:highlight w:val="none"/>
+        </w:rPr>
+      </w:r>
+      <w:r>
+        <w:rPr>
+          <w:highlight w:val="none"/>
+        </w:rPr>
+      </w:r>
+    </w:p>
+    <w:p>
+      <w:pPr>
+        <w:pStyle w:val="139"/>
+        <w:spacing/>
+        <w:ind/>
+        <w:rPr>
+          <w:highlight w:val="none"/>
+        </w:rPr>
+      </w:pPr>
       <w:r/>
       <w:bookmarkStart w:id="11" w:name="_Toc11"/>
+      <w:r/>
       <w:r>
         <w:rPr>
           <w:rFonts w:ascii="Times New Roman" w:hAnsi="Times New Roman" w:eastAsia="Times New Roman" w:cs="Times New Roman"/>
@@ -3454,6 +3625,7 @@
         </w:rPr>
         <w:t xml:space="preserve">. Referencias Bibliográficas</w:t>
       </w:r>
+      <w:r/>
       <w:bookmarkEnd w:id="11"/>
       <w:r/>
       <w:r>

</xml_diff>